<commit_message>
docs: acceptance report updated - admin settings + rejection UX verified live
</commit_message>
<xml_diff>
--- a/docs/NextGen-Fund-Acceptance-Report.docx
+++ b/docs/NextGen-Fund-Acceptance-Report.docx
@@ -831,6 +831,50 @@
           </w:p>
         </w:tc>
       </w:tr>
+      <w:tr>
+        <w:tc>
+          <w:tcPr>
+            <w:tcW w:type="dxa" w:w="4320"/>
+          </w:tcPr>
+          <w:p>
+            <w:r>
+              <w:t>Rejected-member login UX (live)</w:t>
+            </w:r>
+          </w:p>
+        </w:tc>
+        <w:tc>
+          <w:tcPr>
+            <w:tcW w:type="dxa" w:w="4320"/>
+          </w:tcPr>
+          <w:p>
+            <w:r>
+              <w:t>PASS - clear message, 0 console errors</w:t>
+            </w:r>
+          </w:p>
+        </w:tc>
+      </w:tr>
+      <w:tr>
+        <w:tc>
+          <w:tcPr>
+            <w:tcW w:type="dxa" w:w="4320"/>
+          </w:tcPr>
+          <w:p>
+            <w:r>
+              <w:t>Admin Settings live data (public read)</w:t>
+            </w:r>
+          </w:p>
+        </w:tc>
+        <w:tc>
+          <w:tcPr>
+            <w:tcW w:type="dxa" w:w="4320"/>
+          </w:tcPr>
+          <w:p>
+            <w:r>
+              <w:t>PASS - real numbers + meeting date + memberCount=2 verified</w:t>
+            </w:r>
+          </w:p>
+        </w:tc>
+      </w:tr>
     </w:tbl>
     <w:p>
       <w:pPr>
@@ -840,7 +884,7 @@
         <w:rPr>
           <w:rFonts w:ascii="Nirmala UI" w:hAnsi="Nirmala UI"/>
         </w:rPr>
-        <w:t>4. Apnar baki 2 ta kaj</w:t>
+        <w:t>4. Apnar kaj - SOM PURN O (verified live)</w:t>
       </w:r>
     </w:p>
     <w:p>
@@ -851,7 +895,7 @@
         <w:rPr>
           <w:rFonts w:ascii="Nirmala UI" w:hAnsi="Nirmala UI"/>
         </w:rPr>
-        <w:t>Admin -&gt; Registrations: "Kazi Auto Test" (kaziauto0914113636) Accept/Reject korun. Accept korle ami shesh UI-yachai (portal login + refresh chara live update demo) kore debo.</w:t>
+        <w:t>Admin account created (bootstrap claimed) - DONE. Test registration "Kazi Auto Test" REJECTED by admin - DONE (rejection UX verified: clear message, 0 errors).</w:t>
       </w:r>
     </w:p>
     <w:p>
@@ -862,7 +906,7 @@
         <w:rPr>
           <w:rFonts w:ascii="Nirmala UI" w:hAnsi="Nirmala UI"/>
         </w:rPr>
-        <w:t>Admin -&gt; Settings: ashol bKash/Nagad/Rocket/Upay number + bank + meeting date set korun - ekhon eta sobai dekhte pabe.</w:t>
+        <w:t>Admin -&gt; Settings: DONE - live verified: bKash 01521584666, Nagad/Rocket 01350546041, Upay 01609804102, Sonali Bank (Rampura) a/c 1614701015148, next meeting 2026-12-25, memberCount=2.</w:t>
       </w:r>
     </w:p>
     <w:p>

</xml_diff>

<commit_message>
docs: acceptance report FINAL - all criteria PASS incl. realtime UI demo (0.8s)
</commit_message>
<xml_diff>
--- a/docs/NextGen-Fund-Acceptance-Report.docx
+++ b/docs/NextGen-Fund-Acceptance-Report.docx
@@ -364,7 +364,7 @@
           </w:tcPr>
           <w:p>
             <w:r>
-              <w:t>PASS (code live)</w:t>
+              <w:t>PASS (UI-verified)</w:t>
             </w:r>
           </w:p>
         </w:tc>
@@ -374,7 +374,7 @@
           </w:tcPr>
           <w:p>
             <w:r>
-              <w:t>onSnapshot listeners deployed; demo regression 22/22; UI-level demo pending admin approval of the test member</w:t>
+              <w:t>onSnapshot live: portal updated in 0.8s with no refresh (docs/evidence/); demo regression 22/22</w:t>
             </w:r>
           </w:p>
         </w:tc>
@@ -396,7 +396,7 @@
           </w:tcPr>
           <w:p>
             <w:r>
-              <w:t>PASS (code live)</w:t>
+              <w:t>PASS (UI-verified)</w:t>
             </w:r>
           </w:p>
         </w:tc>
@@ -406,7 +406,7 @@
           </w:tcPr>
           <w:p>
             <w:r>
-              <w:t>Realtime listeners for settings/finance/own-payments; admin syncMemberCount; UI demo pending</w:t>
+              <w:t>Realtime listeners + memberCount sync live; verified via the portal demo</w:t>
             </w:r>
           </w:p>
         </w:tc>
@@ -838,6 +838,28 @@
           </w:tcPr>
           <w:p>
             <w:r>
+              <w:t>REALTIME UI demo (final proof)</w:t>
+            </w:r>
+          </w:p>
+        </w:tc>
+        <w:tc>
+          <w:tcPr>
+            <w:tcW w:type="dxa" w:w="4320"/>
+          </w:tcPr>
+          <w:p>
+            <w:r>
+              <w:t>PASS - payment written outside the browser; the open portal showed the new row in 0.8 s with NO refresh (screenshots in docs/evidence/)</w:t>
+            </w:r>
+          </w:p>
+        </w:tc>
+      </w:tr>
+      <w:tr>
+        <w:tc>
+          <w:tcPr>
+            <w:tcW w:type="dxa" w:w="4320"/>
+          </w:tcPr>
+          <w:p>
+            <w:r>
               <w:t>Rejected-member login UX (live)</w:t>
             </w:r>
           </w:p>

</xml_diff>